<commit_message>
docs: sync updated final report + add PDF version
- Updated docs/CodeSentinel_Final_Report.docx to the latest edited version.
- Added docs/CodeSentinel_Final_Report.pdf (renamed from the _USCO_3 export
  for a consistent base name with the .docx).
- README now links both the Word and PDF versions of the final report.

Co-Authored-By: Claude Opus 4.7 (1M context) <noreply@anthropic.com>
</commit_message>
<xml_diff>
--- a/docs/CodeSentinel_Final_Report.docx
+++ b/docs/CodeSentinel_Final_Report.docx
@@ -5,8 +5,14 @@
     <w:p>
       <w:pPr>
         <w:spacing w:after="600"/>
-      </w:pPr>
-      <w:r>
+        <w:rPr>
+          <w:lang w:val="en-US"/>
+        </w:rPr>
+      </w:pPr>
+      <w:r>
+        <w:rPr>
+          <w:lang w:val="en-US"/>
+        </w:rPr>
         <w:t xml:space="preserve"> </w:t>
       </w:r>
     </w:p>
@@ -14,6 +20,9 @@
       <w:pPr>
         <w:spacing w:after="100"/>
         <w:jc w:val="center"/>
+        <w:rPr>
+          <w:lang w:val="en-US"/>
+        </w:rPr>
       </w:pPr>
       <w:r>
         <w:rPr>
@@ -22,6 +31,7 @@
           <w:color w:val="8B0000"/>
           <w:sz w:val="36"/>
           <w:szCs w:val="36"/>
+          <w:lang w:val="en-US"/>
         </w:rPr>
         <w:t>UNIVERSIDAD SURCOLOMBIANA</w:t>
       </w:r>
@@ -30,10 +40,14 @@
       <w:pPr>
         <w:spacing w:after="80"/>
         <w:jc w:val="center"/>
-      </w:pPr>
-      <w:r>
-        <w:rPr>
-          <w:color w:val="1A1A1A"/>
+        <w:rPr>
+          <w:lang w:val="en-US"/>
+        </w:rPr>
+      </w:pPr>
+      <w:r>
+        <w:rPr>
+          <w:color w:val="1A1A1A"/>
+          <w:lang w:val="en-US"/>
         </w:rPr>
         <w:t>Faculty of Engineering</w:t>
       </w:r>
@@ -42,10 +56,14 @@
       <w:pPr>
         <w:spacing w:after="100"/>
         <w:jc w:val="center"/>
-      </w:pPr>
-      <w:r>
-        <w:rPr>
-          <w:color w:val="1A1A1A"/>
+        <w:rPr>
+          <w:lang w:val="en-US"/>
+        </w:rPr>
+      </w:pPr>
+      <w:r>
+        <w:rPr>
+          <w:color w:val="1A1A1A"/>
+          <w:lang w:val="en-US"/>
         </w:rPr>
         <w:t>Software Engineering Program</w:t>
       </w:r>
@@ -54,6 +72,9 @@
       <w:pPr>
         <w:spacing w:after="1200"/>
         <w:jc w:val="center"/>
+        <w:rPr>
+          <w:lang w:val="en-US"/>
+        </w:rPr>
       </w:pPr>
       <w:r>
         <w:rPr>
@@ -62,6 +83,7 @@
           <w:color w:val="555555"/>
           <w:sz w:val="22"/>
           <w:szCs w:val="22"/>
+          <w:lang w:val="en-US"/>
         </w:rPr>
         <w:t>Artificial Intelligence Course — BEINSOF52</w:t>
       </w:r>
@@ -73,6 +95,9 @@
         </w:pBdr>
         <w:spacing w:after="200"/>
         <w:jc w:val="center"/>
+        <w:rPr>
+          <w:lang w:val="en-US"/>
+        </w:rPr>
       </w:pPr>
       <w:r>
         <w:rPr>
@@ -81,6 +106,7 @@
           <w:color w:val="8B0000"/>
           <w:sz w:val="56"/>
           <w:szCs w:val="56"/>
+          <w:lang w:val="en-US"/>
         </w:rPr>
         <w:t>CodeSentinel AI</w:t>
       </w:r>
@@ -89,6 +115,9 @@
       <w:pPr>
         <w:spacing w:before="200" w:after="180"/>
         <w:jc w:val="center"/>
+        <w:rPr>
+          <w:lang w:val="en-US"/>
+        </w:rPr>
       </w:pPr>
       <w:r>
         <w:rPr>
@@ -97,6 +126,7 @@
           <w:color w:val="1A1A1A"/>
           <w:sz w:val="32"/>
           <w:szCs w:val="32"/>
+          <w:lang w:val="en-US"/>
         </w:rPr>
         <w:t>A Local-First, Privacy-Preserving AI Code Reviewer</w:t>
       </w:r>
@@ -105,10 +135,14 @@
       <w:pPr>
         <w:spacing w:after="1000"/>
         <w:jc w:val="center"/>
+        <w:rPr>
+          <w:lang w:val="en-US"/>
+        </w:rPr>
       </w:pPr>
       <w:r>
         <w:rPr>
           <w:color w:val="555555"/>
+          <w:lang w:val="en-US"/>
         </w:rPr>
         <w:t>Project 2 — Artificial Intelligence Applied to Software Engineering</w:t>
       </w:r>
@@ -131,8 +165,13 @@
     </w:p>
     <w:p>
       <w:pPr>
-        <w:spacing w:after="80"/>
+        <w:spacing w:line="276" w:lineRule="auto"/>
+        <w:ind w:firstLine="720"/>
         <w:jc w:val="center"/>
+        <w:rPr>
+          <w:b/>
+          <w:sz w:val="26"/>
+        </w:rPr>
       </w:pPr>
       <w:r>
         <w:rPr>
@@ -144,12 +183,6 @@
         </w:rPr>
         <w:t>Linda Valentina López Rubiano</w:t>
       </w:r>
-    </w:p>
-    <w:p>
-      <w:pPr>
-        <w:spacing w:after="400"/>
-        <w:jc w:val="center"/>
-      </w:pPr>
       <w:r>
         <w:rPr>
           <w:b/>
@@ -158,7 +191,27 @@
           <w:sz w:val="26"/>
           <w:szCs w:val="26"/>
         </w:rPr>
-        <w:t>Juan Felipe Andrade</w:t>
+        <w:t xml:space="preserve"> </w:t>
+      </w:r>
+      <w:r>
+        <w:rPr>
+          <w:b/>
+          <w:sz w:val="26"/>
+        </w:rPr>
+        <w:t>20212199950</w:t>
+      </w:r>
+    </w:p>
+    <w:p>
+      <w:pPr>
+        <w:spacing w:line="276" w:lineRule="auto"/>
+        <w:jc w:val="center"/>
+      </w:pPr>
+      <w:r>
+        <w:rPr>
+          <w:b/>
+          <w:sz w:val="26"/>
+        </w:rPr>
+        <w:t>Juan Felipe Andrade 20212200010</w:t>
       </w:r>
     </w:p>
     <w:p>
@@ -193,12 +246,16 @@
       <w:pPr>
         <w:spacing w:after="60"/>
         <w:jc w:val="center"/>
+        <w:rPr>
+          <w:lang w:val="en-US"/>
+        </w:rPr>
       </w:pPr>
       <w:r>
         <w:rPr>
           <w:color w:val="1A1A1A"/>
           <w:sz w:val="22"/>
           <w:szCs w:val="22"/>
+          <w:lang w:val="en-US"/>
         </w:rPr>
         <w:t>Neiva, Huila — Colombia</w:t>
       </w:r>
@@ -206,24 +263,39 @@
     <w:p>
       <w:pPr>
         <w:jc w:val="center"/>
+        <w:rPr>
+          <w:lang w:val="en-US"/>
+        </w:rPr>
       </w:pPr>
       <w:r>
         <w:rPr>
           <w:color w:val="1A1A1A"/>
           <w:sz w:val="22"/>
           <w:szCs w:val="22"/>
+          <w:lang w:val="en-US"/>
         </w:rPr>
         <w:t>May 2026</w:t>
       </w:r>
     </w:p>
     <w:p>
-      <w:r>
+      <w:pPr>
+        <w:rPr>
+          <w:lang w:val="en-US"/>
+        </w:rPr>
+      </w:pPr>
+      <w:r>
+        <w:rPr>
+          <w:lang w:val="en-US"/>
+        </w:rPr>
         <w:br w:type="page"/>
       </w:r>
     </w:p>
     <w:p>
       <w:pPr>
         <w:spacing w:after="240"/>
+        <w:rPr>
+          <w:lang w:val="en-US"/>
+        </w:rPr>
       </w:pPr>
       <w:r>
         <w:rPr>
@@ -232,6 +304,7 @@
           <w:color w:val="8B0000"/>
           <w:sz w:val="36"/>
           <w:szCs w:val="36"/>
+          <w:lang w:val="en-US"/>
         </w:rPr>
         <w:lastRenderedPageBreak/>
         <w:t>Table of Contents</w:t>
@@ -5330,9 +5403,15 @@
     <w:p>
       <w:pPr>
         <w:pStyle w:val="Ttulo1"/>
+        <w:rPr>
+          <w:lang w:val="en-US"/>
+        </w:rPr>
       </w:pPr>
       <w:bookmarkStart w:id="0" w:name="_Toc230771796"/>
       <w:r>
+        <w:rPr>
+          <w:lang w:val="en-US"/>
+        </w:rPr>
         <w:lastRenderedPageBreak/>
         <w:t>Abstract</w:t>
       </w:r>
@@ -5346,8 +5425,15 @@
       <w:r>
         <w:rPr>
           <w:color w:val="1A1A1A"/>
-        </w:rPr>
-        <w:t>CodeSentinel AI is a code-review assistant that runs entirely on the developer’s own computer. It reads a source file, a pasted snippet, or the changes in a Git commit and returns a structured report of defects, security vulnerabilities, performance problems, style violations, and missing documentation. Each finding carries a severity level, a line reference, an explanation of why the issue matters, and a concrete suggested fix.</w:t>
+          <w:lang w:val="en-US"/>
+        </w:rPr>
+        <w:t xml:space="preserve">CodeSentinel AI is a code-review assistant that runs entirely on the developer’s own computer. It reads a source file, a pasted snippet, or the changes in a Git commit and returns a structured report of defects, security vulnerabilities, performance problems, style violations, and missing documentation. </w:t>
+      </w:r>
+      <w:r>
+        <w:rPr>
+          <w:color w:val="1A1A1A"/>
+        </w:rPr>
+        <w:t>Each finding carries a severity level, a line reference, an explanation of why the issue matters, and a concrete suggested fix.</w:t>
       </w:r>
     </w:p>
     <w:p>
@@ -6099,12 +6185,6 @@
         <w:gridCol w:w="1538"/>
       </w:tblGrid>
       <w:tr>
-        <w:tblPrEx>
-          <w:tblCellMar>
-            <w:top w:w="0" w:type="dxa"/>
-            <w:bottom w:w="0" w:type="dxa"/>
-          </w:tblCellMar>
-        </w:tblPrEx>
         <w:trPr>
           <w:tblHeader/>
         </w:trPr>
@@ -6275,12 +6355,6 @@
         </w:tc>
       </w:tr>
       <w:tr>
-        <w:tblPrEx>
-          <w:tblCellMar>
-            <w:top w:w="0" w:type="dxa"/>
-            <w:bottom w:w="0" w:type="dxa"/>
-          </w:tblCellMar>
-        </w:tblPrEx>
         <w:tc>
           <w:tcPr>
             <w:tcW w:w="2200" w:type="dxa"/>
@@ -6438,12 +6512,6 @@
         </w:tc>
       </w:tr>
       <w:tr>
-        <w:tblPrEx>
-          <w:tblCellMar>
-            <w:top w:w="0" w:type="dxa"/>
-            <w:bottom w:w="0" w:type="dxa"/>
-          </w:tblCellMar>
-        </w:tblPrEx>
         <w:tc>
           <w:tcPr>
             <w:tcW w:w="2200" w:type="dxa"/>
@@ -6606,12 +6674,6 @@
         </w:tc>
       </w:tr>
       <w:tr>
-        <w:tblPrEx>
-          <w:tblCellMar>
-            <w:top w:w="0" w:type="dxa"/>
-            <w:bottom w:w="0" w:type="dxa"/>
-          </w:tblCellMar>
-        </w:tblPrEx>
         <w:tc>
           <w:tcPr>
             <w:tcW w:w="2200" w:type="dxa"/>
@@ -6769,12 +6831,6 @@
         </w:tc>
       </w:tr>
       <w:tr>
-        <w:tblPrEx>
-          <w:tblCellMar>
-            <w:top w:w="0" w:type="dxa"/>
-            <w:bottom w:w="0" w:type="dxa"/>
-          </w:tblCellMar>
-        </w:tblPrEx>
         <w:tc>
           <w:tcPr>
             <w:tcW w:w="2200" w:type="dxa"/>
@@ -6937,12 +6993,6 @@
         </w:tc>
       </w:tr>
       <w:tr>
-        <w:tblPrEx>
-          <w:tblCellMar>
-            <w:top w:w="0" w:type="dxa"/>
-            <w:bottom w:w="0" w:type="dxa"/>
-          </w:tblCellMar>
-        </w:tblPrEx>
         <w:tc>
           <w:tcPr>
             <w:tcW w:w="2200" w:type="dxa"/>
@@ -7100,12 +7150,6 @@
         </w:tc>
       </w:tr>
       <w:tr>
-        <w:tblPrEx>
-          <w:tblCellMar>
-            <w:top w:w="0" w:type="dxa"/>
-            <w:bottom w:w="0" w:type="dxa"/>
-          </w:tblCellMar>
-        </w:tblPrEx>
         <w:tc>
           <w:tcPr>
             <w:tcW w:w="2200" w:type="dxa"/>
@@ -7268,12 +7312,6 @@
         </w:tc>
       </w:tr>
       <w:tr>
-        <w:tblPrEx>
-          <w:tblCellMar>
-            <w:top w:w="0" w:type="dxa"/>
-            <w:bottom w:w="0" w:type="dxa"/>
-          </w:tblCellMar>
-        </w:tblPrEx>
         <w:tc>
           <w:tcPr>
             <w:tcW w:w="2200" w:type="dxa"/>
@@ -7549,12 +7587,6 @@
         <w:gridCol w:w="2400"/>
       </w:tblGrid>
       <w:tr>
-        <w:tblPrEx>
-          <w:tblCellMar>
-            <w:top w:w="0" w:type="dxa"/>
-            <w:bottom w:w="0" w:type="dxa"/>
-          </w:tblCellMar>
-        </w:tblPrEx>
         <w:trPr>
           <w:tblHeader/>
         </w:trPr>
@@ -7660,12 +7692,6 @@
         </w:tc>
       </w:tr>
       <w:tr>
-        <w:tblPrEx>
-          <w:tblCellMar>
-            <w:top w:w="0" w:type="dxa"/>
-            <w:bottom w:w="0" w:type="dxa"/>
-          </w:tblCellMar>
-        </w:tblPrEx>
         <w:tc>
           <w:tcPr>
             <w:tcW w:w="900" w:type="dxa"/>
@@ -7761,12 +7787,6 @@
         </w:tc>
       </w:tr>
       <w:tr>
-        <w:tblPrEx>
-          <w:tblCellMar>
-            <w:top w:w="0" w:type="dxa"/>
-            <w:bottom w:w="0" w:type="dxa"/>
-          </w:tblCellMar>
-        </w:tblPrEx>
         <w:tc>
           <w:tcPr>
             <w:tcW w:w="900" w:type="dxa"/>
@@ -7865,12 +7885,6 @@
         </w:tc>
       </w:tr>
       <w:tr>
-        <w:tblPrEx>
-          <w:tblCellMar>
-            <w:top w:w="0" w:type="dxa"/>
-            <w:bottom w:w="0" w:type="dxa"/>
-          </w:tblCellMar>
-        </w:tblPrEx>
         <w:tc>
           <w:tcPr>
             <w:tcW w:w="900" w:type="dxa"/>
@@ -7966,12 +7980,6 @@
         </w:tc>
       </w:tr>
       <w:tr>
-        <w:tblPrEx>
-          <w:tblCellMar>
-            <w:top w:w="0" w:type="dxa"/>
-            <w:bottom w:w="0" w:type="dxa"/>
-          </w:tblCellMar>
-        </w:tblPrEx>
         <w:tc>
           <w:tcPr>
             <w:tcW w:w="900" w:type="dxa"/>
@@ -8070,12 +8078,6 @@
         </w:tc>
       </w:tr>
       <w:tr>
-        <w:tblPrEx>
-          <w:tblCellMar>
-            <w:top w:w="0" w:type="dxa"/>
-            <w:bottom w:w="0" w:type="dxa"/>
-          </w:tblCellMar>
-        </w:tblPrEx>
         <w:tc>
           <w:tcPr>
             <w:tcW w:w="900" w:type="dxa"/>
@@ -8171,12 +8173,6 @@
         </w:tc>
       </w:tr>
       <w:tr>
-        <w:tblPrEx>
-          <w:tblCellMar>
-            <w:top w:w="0" w:type="dxa"/>
-            <w:bottom w:w="0" w:type="dxa"/>
-          </w:tblCellMar>
-        </w:tblPrEx>
         <w:tc>
           <w:tcPr>
             <w:tcW w:w="900" w:type="dxa"/>
@@ -8275,12 +8271,6 @@
         </w:tc>
       </w:tr>
       <w:tr>
-        <w:tblPrEx>
-          <w:tblCellMar>
-            <w:top w:w="0" w:type="dxa"/>
-            <w:bottom w:w="0" w:type="dxa"/>
-          </w:tblCellMar>
-        </w:tblPrEx>
         <w:tc>
           <w:tcPr>
             <w:tcW w:w="900" w:type="dxa"/>
@@ -8376,12 +8366,6 @@
         </w:tc>
       </w:tr>
       <w:tr>
-        <w:tblPrEx>
-          <w:tblCellMar>
-            <w:top w:w="0" w:type="dxa"/>
-            <w:bottom w:w="0" w:type="dxa"/>
-          </w:tblCellMar>
-        </w:tblPrEx>
         <w:tc>
           <w:tcPr>
             <w:tcW w:w="900" w:type="dxa"/>
@@ -8480,12 +8464,6 @@
         </w:tc>
       </w:tr>
       <w:tr>
-        <w:tblPrEx>
-          <w:tblCellMar>
-            <w:top w:w="0" w:type="dxa"/>
-            <w:bottom w:w="0" w:type="dxa"/>
-          </w:tblCellMar>
-        </w:tblPrEx>
         <w:tc>
           <w:tcPr>
             <w:tcW w:w="900" w:type="dxa"/>
@@ -8581,12 +8559,6 @@
         </w:tc>
       </w:tr>
       <w:tr>
-        <w:tblPrEx>
-          <w:tblCellMar>
-            <w:top w:w="0" w:type="dxa"/>
-            <w:bottom w:w="0" w:type="dxa"/>
-          </w:tblCellMar>
-        </w:tblPrEx>
         <w:tc>
           <w:tcPr>
             <w:tcW w:w="900" w:type="dxa"/>
@@ -8685,12 +8657,6 @@
         </w:tc>
       </w:tr>
       <w:tr>
-        <w:tblPrEx>
-          <w:tblCellMar>
-            <w:top w:w="0" w:type="dxa"/>
-            <w:bottom w:w="0" w:type="dxa"/>
-          </w:tblCellMar>
-        </w:tblPrEx>
         <w:tc>
           <w:tcPr>
             <w:tcW w:w="900" w:type="dxa"/>
@@ -8787,12 +8753,6 @@
         </w:tc>
       </w:tr>
       <w:tr>
-        <w:tblPrEx>
-          <w:tblCellMar>
-            <w:top w:w="0" w:type="dxa"/>
-            <w:bottom w:w="0" w:type="dxa"/>
-          </w:tblCellMar>
-        </w:tblPrEx>
         <w:tc>
           <w:tcPr>
             <w:tcW w:w="900" w:type="dxa"/>
@@ -8891,12 +8851,6 @@
         </w:tc>
       </w:tr>
       <w:tr>
-        <w:tblPrEx>
-          <w:tblCellMar>
-            <w:top w:w="0" w:type="dxa"/>
-            <w:bottom w:w="0" w:type="dxa"/>
-          </w:tblCellMar>
-        </w:tblPrEx>
         <w:tc>
           <w:tcPr>
             <w:tcW w:w="900" w:type="dxa"/>
@@ -8992,12 +8946,6 @@
         </w:tc>
       </w:tr>
       <w:tr>
-        <w:tblPrEx>
-          <w:tblCellMar>
-            <w:top w:w="0" w:type="dxa"/>
-            <w:bottom w:w="0" w:type="dxa"/>
-          </w:tblCellMar>
-        </w:tblPrEx>
         <w:tc>
           <w:tcPr>
             <w:tcW w:w="900" w:type="dxa"/>
@@ -9096,12 +9044,6 @@
         </w:tc>
       </w:tr>
       <w:tr>
-        <w:tblPrEx>
-          <w:tblCellMar>
-            <w:top w:w="0" w:type="dxa"/>
-            <w:bottom w:w="0" w:type="dxa"/>
-          </w:tblCellMar>
-        </w:tblPrEx>
         <w:tc>
           <w:tcPr>
             <w:tcW w:w="900" w:type="dxa"/>
@@ -9259,12 +9201,6 @@
         <w:gridCol w:w="1800"/>
       </w:tblGrid>
       <w:tr>
-        <w:tblPrEx>
-          <w:tblCellMar>
-            <w:top w:w="0" w:type="dxa"/>
-            <w:bottom w:w="0" w:type="dxa"/>
-          </w:tblCellMar>
-        </w:tblPrEx>
         <w:trPr>
           <w:tblHeader/>
         </w:trPr>
@@ -9402,12 +9338,6 @@
         </w:tc>
       </w:tr>
       <w:tr>
-        <w:tblPrEx>
-          <w:tblCellMar>
-            <w:top w:w="0" w:type="dxa"/>
-            <w:bottom w:w="0" w:type="dxa"/>
-          </w:tblCellMar>
-        </w:tblPrEx>
         <w:tc>
           <w:tcPr>
             <w:tcW w:w="900" w:type="dxa"/>
@@ -9534,12 +9464,6 @@
         </w:tc>
       </w:tr>
       <w:tr>
-        <w:tblPrEx>
-          <w:tblCellMar>
-            <w:top w:w="0" w:type="dxa"/>
-            <w:bottom w:w="0" w:type="dxa"/>
-          </w:tblCellMar>
-        </w:tblPrEx>
         <w:tc>
           <w:tcPr>
             <w:tcW w:w="900" w:type="dxa"/>
@@ -9670,12 +9594,6 @@
         </w:tc>
       </w:tr>
       <w:tr>
-        <w:tblPrEx>
-          <w:tblCellMar>
-            <w:top w:w="0" w:type="dxa"/>
-            <w:bottom w:w="0" w:type="dxa"/>
-          </w:tblCellMar>
-        </w:tblPrEx>
         <w:tc>
           <w:tcPr>
             <w:tcW w:w="900" w:type="dxa"/>
@@ -9802,12 +9720,6 @@
         </w:tc>
       </w:tr>
       <w:tr>
-        <w:tblPrEx>
-          <w:tblCellMar>
-            <w:top w:w="0" w:type="dxa"/>
-            <w:bottom w:w="0" w:type="dxa"/>
-          </w:tblCellMar>
-        </w:tblPrEx>
         <w:tc>
           <w:tcPr>
             <w:tcW w:w="900" w:type="dxa"/>
@@ -9938,12 +9850,6 @@
         </w:tc>
       </w:tr>
       <w:tr>
-        <w:tblPrEx>
-          <w:tblCellMar>
-            <w:top w:w="0" w:type="dxa"/>
-            <w:bottom w:w="0" w:type="dxa"/>
-          </w:tblCellMar>
-        </w:tblPrEx>
         <w:tc>
           <w:tcPr>
             <w:tcW w:w="900" w:type="dxa"/>
@@ -10070,12 +9976,6 @@
         </w:tc>
       </w:tr>
       <w:tr>
-        <w:tblPrEx>
-          <w:tblCellMar>
-            <w:top w:w="0" w:type="dxa"/>
-            <w:bottom w:w="0" w:type="dxa"/>
-          </w:tblCellMar>
-        </w:tblPrEx>
         <w:tc>
           <w:tcPr>
             <w:tcW w:w="900" w:type="dxa"/>
@@ -10207,12 +10107,6 @@
         </w:tc>
       </w:tr>
       <w:tr>
-        <w:tblPrEx>
-          <w:tblCellMar>
-            <w:top w:w="0" w:type="dxa"/>
-            <w:bottom w:w="0" w:type="dxa"/>
-          </w:tblCellMar>
-        </w:tblPrEx>
         <w:tc>
           <w:tcPr>
             <w:tcW w:w="900" w:type="dxa"/>
@@ -10339,12 +10233,6 @@
         </w:tc>
       </w:tr>
       <w:tr>
-        <w:tblPrEx>
-          <w:tblCellMar>
-            <w:top w:w="0" w:type="dxa"/>
-            <w:bottom w:w="0" w:type="dxa"/>
-          </w:tblCellMar>
-        </w:tblPrEx>
         <w:tc>
           <w:tcPr>
             <w:tcW w:w="900" w:type="dxa"/>
@@ -10475,12 +10363,6 @@
         </w:tc>
       </w:tr>
       <w:tr>
-        <w:tblPrEx>
-          <w:tblCellMar>
-            <w:top w:w="0" w:type="dxa"/>
-            <w:bottom w:w="0" w:type="dxa"/>
-          </w:tblCellMar>
-        </w:tblPrEx>
         <w:tc>
           <w:tcPr>
             <w:tcW w:w="900" w:type="dxa"/>
@@ -11479,12 +11361,6 @@
         <w:gridCol w:w="3838"/>
       </w:tblGrid>
       <w:tr>
-        <w:tblPrEx>
-          <w:tblCellMar>
-            <w:top w:w="0" w:type="dxa"/>
-            <w:bottom w:w="0" w:type="dxa"/>
-          </w:tblCellMar>
-        </w:tblPrEx>
         <w:trPr>
           <w:tblHeader/>
         </w:trPr>
@@ -11622,12 +11498,6 @@
         </w:tc>
       </w:tr>
       <w:tr>
-        <w:tblPrEx>
-          <w:tblCellMar>
-            <w:top w:w="0" w:type="dxa"/>
-            <w:bottom w:w="0" w:type="dxa"/>
-          </w:tblCellMar>
-        </w:tblPrEx>
         <w:tc>
           <w:tcPr>
             <w:tcW w:w="1500" w:type="dxa"/>
@@ -11754,12 +11624,6 @@
         </w:tc>
       </w:tr>
       <w:tr>
-        <w:tblPrEx>
-          <w:tblCellMar>
-            <w:top w:w="0" w:type="dxa"/>
-            <w:bottom w:w="0" w:type="dxa"/>
-          </w:tblCellMar>
-        </w:tblPrEx>
         <w:tc>
           <w:tcPr>
             <w:tcW w:w="1500" w:type="dxa"/>
@@ -11890,12 +11754,6 @@
         </w:tc>
       </w:tr>
       <w:tr>
-        <w:tblPrEx>
-          <w:tblCellMar>
-            <w:top w:w="0" w:type="dxa"/>
-            <w:bottom w:w="0" w:type="dxa"/>
-          </w:tblCellMar>
-        </w:tblPrEx>
         <w:tc>
           <w:tcPr>
             <w:tcW w:w="1500" w:type="dxa"/>
@@ -12022,12 +11880,6 @@
         </w:tc>
       </w:tr>
       <w:tr>
-        <w:tblPrEx>
-          <w:tblCellMar>
-            <w:top w:w="0" w:type="dxa"/>
-            <w:bottom w:w="0" w:type="dxa"/>
-          </w:tblCellMar>
-        </w:tblPrEx>
         <w:tc>
           <w:tcPr>
             <w:tcW w:w="1500" w:type="dxa"/>
@@ -12158,12 +12010,6 @@
         </w:tc>
       </w:tr>
       <w:tr>
-        <w:tblPrEx>
-          <w:tblCellMar>
-            <w:top w:w="0" w:type="dxa"/>
-            <w:bottom w:w="0" w:type="dxa"/>
-          </w:tblCellMar>
-        </w:tblPrEx>
         <w:tc>
           <w:tcPr>
             <w:tcW w:w="1500" w:type="dxa"/>
@@ -12290,12 +12136,6 @@
         </w:tc>
       </w:tr>
       <w:tr>
-        <w:tblPrEx>
-          <w:tblCellMar>
-            <w:top w:w="0" w:type="dxa"/>
-            <w:bottom w:w="0" w:type="dxa"/>
-          </w:tblCellMar>
-        </w:tblPrEx>
         <w:tc>
           <w:tcPr>
             <w:tcW w:w="1500" w:type="dxa"/>
@@ -12426,12 +12266,6 @@
         </w:tc>
       </w:tr>
       <w:tr>
-        <w:tblPrEx>
-          <w:tblCellMar>
-            <w:top w:w="0" w:type="dxa"/>
-            <w:bottom w:w="0" w:type="dxa"/>
-          </w:tblCellMar>
-        </w:tblPrEx>
         <w:tc>
           <w:tcPr>
             <w:tcW w:w="1500" w:type="dxa"/>
@@ -12558,12 +12392,6 @@
         </w:tc>
       </w:tr>
       <w:tr>
-        <w:tblPrEx>
-          <w:tblCellMar>
-            <w:top w:w="0" w:type="dxa"/>
-            <w:bottom w:w="0" w:type="dxa"/>
-          </w:tblCellMar>
-        </w:tblPrEx>
         <w:tc>
           <w:tcPr>
             <w:tcW w:w="1500" w:type="dxa"/>
@@ -12695,12 +12523,6 @@
         </w:tc>
       </w:tr>
       <w:tr>
-        <w:tblPrEx>
-          <w:tblCellMar>
-            <w:top w:w="0" w:type="dxa"/>
-            <w:bottom w:w="0" w:type="dxa"/>
-          </w:tblCellMar>
-        </w:tblPrEx>
         <w:tc>
           <w:tcPr>
             <w:tcW w:w="1500" w:type="dxa"/>
@@ -12827,12 +12649,6 @@
         </w:tc>
       </w:tr>
       <w:tr>
-        <w:tblPrEx>
-          <w:tblCellMar>
-            <w:top w:w="0" w:type="dxa"/>
-            <w:bottom w:w="0" w:type="dxa"/>
-          </w:tblCellMar>
-        </w:tblPrEx>
         <w:tc>
           <w:tcPr>
             <w:tcW w:w="1500" w:type="dxa"/>
@@ -13025,12 +12841,6 @@
         <w:gridCol w:w="3514"/>
       </w:tblGrid>
       <w:tr>
-        <w:tblPrEx>
-          <w:tblCellMar>
-            <w:top w:w="0" w:type="dxa"/>
-            <w:bottom w:w="0" w:type="dxa"/>
-          </w:tblCellMar>
-        </w:tblPrEx>
         <w:trPr>
           <w:tblHeader/>
         </w:trPr>
@@ -13168,12 +12978,6 @@
         </w:tc>
       </w:tr>
       <w:tr>
-        <w:tblPrEx>
-          <w:tblCellMar>
-            <w:top w:w="0" w:type="dxa"/>
-            <w:bottom w:w="0" w:type="dxa"/>
-          </w:tblCellMar>
-        </w:tblPrEx>
         <w:tc>
           <w:tcPr>
             <w:tcW w:w="1700" w:type="dxa"/>
@@ -13300,12 +13104,6 @@
         </w:tc>
       </w:tr>
       <w:tr>
-        <w:tblPrEx>
-          <w:tblCellMar>
-            <w:top w:w="0" w:type="dxa"/>
-            <w:bottom w:w="0" w:type="dxa"/>
-          </w:tblCellMar>
-        </w:tblPrEx>
         <w:tc>
           <w:tcPr>
             <w:tcW w:w="1700" w:type="dxa"/>
@@ -13436,12 +13234,6 @@
         </w:tc>
       </w:tr>
       <w:tr>
-        <w:tblPrEx>
-          <w:tblCellMar>
-            <w:top w:w="0" w:type="dxa"/>
-            <w:bottom w:w="0" w:type="dxa"/>
-          </w:tblCellMar>
-        </w:tblPrEx>
         <w:tc>
           <w:tcPr>
             <w:tcW w:w="1700" w:type="dxa"/>
@@ -13568,12 +13360,6 @@
         </w:tc>
       </w:tr>
       <w:tr>
-        <w:tblPrEx>
-          <w:tblCellMar>
-            <w:top w:w="0" w:type="dxa"/>
-            <w:bottom w:w="0" w:type="dxa"/>
-          </w:tblCellMar>
-        </w:tblPrEx>
         <w:tc>
           <w:tcPr>
             <w:tcW w:w="1700" w:type="dxa"/>
@@ -13704,12 +13490,6 @@
         </w:tc>
       </w:tr>
       <w:tr>
-        <w:tblPrEx>
-          <w:tblCellMar>
-            <w:top w:w="0" w:type="dxa"/>
-            <w:bottom w:w="0" w:type="dxa"/>
-          </w:tblCellMar>
-        </w:tblPrEx>
         <w:tc>
           <w:tcPr>
             <w:tcW w:w="1700" w:type="dxa"/>
@@ -13836,12 +13616,6 @@
         </w:tc>
       </w:tr>
       <w:tr>
-        <w:tblPrEx>
-          <w:tblCellMar>
-            <w:top w:w="0" w:type="dxa"/>
-            <w:bottom w:w="0" w:type="dxa"/>
-          </w:tblCellMar>
-        </w:tblPrEx>
         <w:tc>
           <w:tcPr>
             <w:tcW w:w="1700" w:type="dxa"/>
@@ -13972,12 +13746,6 @@
         </w:tc>
       </w:tr>
       <w:tr>
-        <w:tblPrEx>
-          <w:tblCellMar>
-            <w:top w:w="0" w:type="dxa"/>
-            <w:bottom w:w="0" w:type="dxa"/>
-          </w:tblCellMar>
-        </w:tblPrEx>
         <w:tc>
           <w:tcPr>
             <w:tcW w:w="1700" w:type="dxa"/>
@@ -14104,12 +13872,6 @@
         </w:tc>
       </w:tr>
       <w:tr>
-        <w:tblPrEx>
-          <w:tblCellMar>
-            <w:top w:w="0" w:type="dxa"/>
-            <w:bottom w:w="0" w:type="dxa"/>
-          </w:tblCellMar>
-        </w:tblPrEx>
         <w:tc>
           <w:tcPr>
             <w:tcW w:w="1700" w:type="dxa"/>
@@ -15151,12 +14913,6 @@
         <w:gridCol w:w="6138"/>
       </w:tblGrid>
       <w:tr>
-        <w:tblPrEx>
-          <w:tblCellMar>
-            <w:top w:w="0" w:type="dxa"/>
-            <w:bottom w:w="0" w:type="dxa"/>
-          </w:tblCellMar>
-        </w:tblPrEx>
         <w:trPr>
           <w:tblHeader/>
         </w:trPr>
@@ -15228,12 +14984,6 @@
         </w:tc>
       </w:tr>
       <w:tr>
-        <w:tblPrEx>
-          <w:tblCellMar>
-            <w:top w:w="0" w:type="dxa"/>
-            <w:bottom w:w="0" w:type="dxa"/>
-          </w:tblCellMar>
-        </w:tblPrEx>
         <w:tc>
           <w:tcPr>
             <w:tcW w:w="2700" w:type="dxa"/>
@@ -15298,12 +15048,6 @@
         </w:tc>
       </w:tr>
       <w:tr>
-        <w:tblPrEx>
-          <w:tblCellMar>
-            <w:top w:w="0" w:type="dxa"/>
-            <w:bottom w:w="0" w:type="dxa"/>
-          </w:tblCellMar>
-        </w:tblPrEx>
         <w:tc>
           <w:tcPr>
             <w:tcW w:w="2700" w:type="dxa"/>
@@ -15370,12 +15114,6 @@
         </w:tc>
       </w:tr>
       <w:tr>
-        <w:tblPrEx>
-          <w:tblCellMar>
-            <w:top w:w="0" w:type="dxa"/>
-            <w:bottom w:w="0" w:type="dxa"/>
-          </w:tblCellMar>
-        </w:tblPrEx>
         <w:tc>
           <w:tcPr>
             <w:tcW w:w="2700" w:type="dxa"/>
@@ -15440,12 +15178,6 @@
         </w:tc>
       </w:tr>
       <w:tr>
-        <w:tblPrEx>
-          <w:tblCellMar>
-            <w:top w:w="0" w:type="dxa"/>
-            <w:bottom w:w="0" w:type="dxa"/>
-          </w:tblCellMar>
-        </w:tblPrEx>
         <w:tc>
           <w:tcPr>
             <w:tcW w:w="2700" w:type="dxa"/>
@@ -15512,12 +15244,6 @@
         </w:tc>
       </w:tr>
       <w:tr>
-        <w:tblPrEx>
-          <w:tblCellMar>
-            <w:top w:w="0" w:type="dxa"/>
-            <w:bottom w:w="0" w:type="dxa"/>
-          </w:tblCellMar>
-        </w:tblPrEx>
         <w:tc>
           <w:tcPr>
             <w:tcW w:w="2700" w:type="dxa"/>
@@ -15582,12 +15308,6 @@
         </w:tc>
       </w:tr>
       <w:tr>
-        <w:tblPrEx>
-          <w:tblCellMar>
-            <w:top w:w="0" w:type="dxa"/>
-            <w:bottom w:w="0" w:type="dxa"/>
-          </w:tblCellMar>
-        </w:tblPrEx>
         <w:tc>
           <w:tcPr>
             <w:tcW w:w="2700" w:type="dxa"/>
@@ -15654,12 +15374,6 @@
         </w:tc>
       </w:tr>
       <w:tr>
-        <w:tblPrEx>
-          <w:tblCellMar>
-            <w:top w:w="0" w:type="dxa"/>
-            <w:bottom w:w="0" w:type="dxa"/>
-          </w:tblCellMar>
-        </w:tblPrEx>
         <w:tc>
           <w:tcPr>
             <w:tcW w:w="2700" w:type="dxa"/>
@@ -16297,12 +16011,6 @@
         <w:gridCol w:w="2594"/>
       </w:tblGrid>
       <w:tr>
-        <w:tblPrEx>
-          <w:tblCellMar>
-            <w:top w:w="0" w:type="dxa"/>
-            <w:bottom w:w="0" w:type="dxa"/>
-          </w:tblCellMar>
-        </w:tblPrEx>
         <w:trPr>
           <w:tblHeader/>
         </w:trPr>
@@ -16407,12 +16115,6 @@
         </w:tc>
       </w:tr>
       <w:tr>
-        <w:tblPrEx>
-          <w:tblCellMar>
-            <w:top w:w="0" w:type="dxa"/>
-            <w:bottom w:w="0" w:type="dxa"/>
-          </w:tblCellMar>
-        </w:tblPrEx>
         <w:tc>
           <w:tcPr>
             <w:tcW w:w="2400" w:type="dxa"/>
@@ -16508,12 +16210,6 @@
         </w:tc>
       </w:tr>
       <w:tr>
-        <w:tblPrEx>
-          <w:tblCellMar>
-            <w:top w:w="0" w:type="dxa"/>
-            <w:bottom w:w="0" w:type="dxa"/>
-          </w:tblCellMar>
-        </w:tblPrEx>
         <w:tc>
           <w:tcPr>
             <w:tcW w:w="2400" w:type="dxa"/>
@@ -16621,12 +16317,6 @@
         </w:tc>
       </w:tr>
       <w:tr>
-        <w:tblPrEx>
-          <w:tblCellMar>
-            <w:top w:w="0" w:type="dxa"/>
-            <w:bottom w:w="0" w:type="dxa"/>
-          </w:tblCellMar>
-        </w:tblPrEx>
         <w:tc>
           <w:tcPr>
             <w:tcW w:w="2400" w:type="dxa"/>
@@ -16722,12 +16412,6 @@
         </w:tc>
       </w:tr>
       <w:tr>
-        <w:tblPrEx>
-          <w:tblCellMar>
-            <w:top w:w="0" w:type="dxa"/>
-            <w:bottom w:w="0" w:type="dxa"/>
-          </w:tblCellMar>
-        </w:tblPrEx>
         <w:tc>
           <w:tcPr>
             <w:tcW w:w="2400" w:type="dxa"/>
@@ -16826,12 +16510,6 @@
         </w:tc>
       </w:tr>
       <w:tr>
-        <w:tblPrEx>
-          <w:tblCellMar>
-            <w:top w:w="0" w:type="dxa"/>
-            <w:bottom w:w="0" w:type="dxa"/>
-          </w:tblCellMar>
-        </w:tblPrEx>
         <w:tc>
           <w:tcPr>
             <w:tcW w:w="2400" w:type="dxa"/>
@@ -16988,12 +16666,6 @@
         <w:gridCol w:w="3000"/>
       </w:tblGrid>
       <w:tr>
-        <w:tblPrEx>
-          <w:tblCellMar>
-            <w:top w:w="0" w:type="dxa"/>
-            <w:bottom w:w="0" w:type="dxa"/>
-          </w:tblCellMar>
-        </w:tblPrEx>
         <w:trPr>
           <w:tblHeader/>
         </w:trPr>
@@ -17098,12 +16770,6 @@
         </w:tc>
       </w:tr>
       <w:tr>
-        <w:tblPrEx>
-          <w:tblCellMar>
-            <w:top w:w="0" w:type="dxa"/>
-            <w:bottom w:w="0" w:type="dxa"/>
-          </w:tblCellMar>
-        </w:tblPrEx>
         <w:tc>
           <w:tcPr>
             <w:tcW w:w="2400" w:type="dxa"/>
@@ -17199,12 +16865,6 @@
         </w:tc>
       </w:tr>
       <w:tr>
-        <w:tblPrEx>
-          <w:tblCellMar>
-            <w:top w:w="0" w:type="dxa"/>
-            <w:bottom w:w="0" w:type="dxa"/>
-          </w:tblCellMar>
-        </w:tblPrEx>
         <w:tc>
           <w:tcPr>
             <w:tcW w:w="2400" w:type="dxa"/>
@@ -17303,12 +16963,6 @@
         </w:tc>
       </w:tr>
       <w:tr>
-        <w:tblPrEx>
-          <w:tblCellMar>
-            <w:top w:w="0" w:type="dxa"/>
-            <w:bottom w:w="0" w:type="dxa"/>
-          </w:tblCellMar>
-        </w:tblPrEx>
         <w:tc>
           <w:tcPr>
             <w:tcW w:w="2400" w:type="dxa"/>
@@ -17404,12 +17058,6 @@
         </w:tc>
       </w:tr>
       <w:tr>
-        <w:tblPrEx>
-          <w:tblCellMar>
-            <w:top w:w="0" w:type="dxa"/>
-            <w:bottom w:w="0" w:type="dxa"/>
-          </w:tblCellMar>
-        </w:tblPrEx>
         <w:tc>
           <w:tcPr>
             <w:tcW w:w="2400" w:type="dxa"/>
@@ -17508,12 +17156,6 @@
         </w:tc>
       </w:tr>
       <w:tr>
-        <w:tblPrEx>
-          <w:tblCellMar>
-            <w:top w:w="0" w:type="dxa"/>
-            <w:bottom w:w="0" w:type="dxa"/>
-          </w:tblCellMar>
-        </w:tblPrEx>
         <w:tc>
           <w:tcPr>
             <w:tcW w:w="2400" w:type="dxa"/>
@@ -17609,12 +17251,6 @@
         </w:tc>
       </w:tr>
       <w:tr>
-        <w:tblPrEx>
-          <w:tblCellMar>
-            <w:top w:w="0" w:type="dxa"/>
-            <w:bottom w:w="0" w:type="dxa"/>
-          </w:tblCellMar>
-        </w:tblPrEx>
         <w:tc>
           <w:tcPr>
             <w:tcW w:w="2400" w:type="dxa"/>
@@ -18013,12 +17649,6 @@
         <w:gridCol w:w="1000"/>
       </w:tblGrid>
       <w:tr>
-        <w:tblPrEx>
-          <w:tblCellMar>
-            <w:top w:w="0" w:type="dxa"/>
-            <w:bottom w:w="0" w:type="dxa"/>
-          </w:tblCellMar>
-        </w:tblPrEx>
         <w:trPr>
           <w:tblHeader/>
         </w:trPr>
@@ -18124,12 +17754,6 @@
         </w:tc>
       </w:tr>
       <w:tr>
-        <w:tblPrEx>
-          <w:tblCellMar>
-            <w:top w:w="0" w:type="dxa"/>
-            <w:bottom w:w="0" w:type="dxa"/>
-          </w:tblCellMar>
-        </w:tblPrEx>
         <w:tc>
           <w:tcPr>
             <w:tcW w:w="2700" w:type="dxa"/>
@@ -18225,12 +17849,6 @@
         </w:tc>
       </w:tr>
       <w:tr>
-        <w:tblPrEx>
-          <w:tblCellMar>
-            <w:top w:w="0" w:type="dxa"/>
-            <w:bottom w:w="0" w:type="dxa"/>
-          </w:tblCellMar>
-        </w:tblPrEx>
         <w:tc>
           <w:tcPr>
             <w:tcW w:w="2700" w:type="dxa"/>
@@ -18329,12 +17947,6 @@
         </w:tc>
       </w:tr>
       <w:tr>
-        <w:tblPrEx>
-          <w:tblCellMar>
-            <w:top w:w="0" w:type="dxa"/>
-            <w:bottom w:w="0" w:type="dxa"/>
-          </w:tblCellMar>
-        </w:tblPrEx>
         <w:tc>
           <w:tcPr>
             <w:tcW w:w="2700" w:type="dxa"/>
@@ -18430,12 +18042,6 @@
         </w:tc>
       </w:tr>
       <w:tr>
-        <w:tblPrEx>
-          <w:tblCellMar>
-            <w:top w:w="0" w:type="dxa"/>
-            <w:bottom w:w="0" w:type="dxa"/>
-          </w:tblCellMar>
-        </w:tblPrEx>
         <w:tc>
           <w:tcPr>
             <w:tcW w:w="2700" w:type="dxa"/>
@@ -18534,12 +18140,6 @@
         </w:tc>
       </w:tr>
       <w:tr>
-        <w:tblPrEx>
-          <w:tblCellMar>
-            <w:top w:w="0" w:type="dxa"/>
-            <w:bottom w:w="0" w:type="dxa"/>
-          </w:tblCellMar>
-        </w:tblPrEx>
         <w:tc>
           <w:tcPr>
             <w:tcW w:w="2700" w:type="dxa"/>
@@ -18635,12 +18235,6 @@
         </w:tc>
       </w:tr>
       <w:tr>
-        <w:tblPrEx>
-          <w:tblCellMar>
-            <w:top w:w="0" w:type="dxa"/>
-            <w:bottom w:w="0" w:type="dxa"/>
-          </w:tblCellMar>
-        </w:tblPrEx>
         <w:tc>
           <w:tcPr>
             <w:tcW w:w="2700" w:type="dxa"/>
@@ -18739,12 +18333,6 @@
         </w:tc>
       </w:tr>
       <w:tr>
-        <w:tblPrEx>
-          <w:tblCellMar>
-            <w:top w:w="0" w:type="dxa"/>
-            <w:bottom w:w="0" w:type="dxa"/>
-          </w:tblCellMar>
-        </w:tblPrEx>
         <w:tc>
           <w:tcPr>
             <w:tcW w:w="2700" w:type="dxa"/>
@@ -18840,12 +18428,6 @@
         </w:tc>
       </w:tr>
       <w:tr>
-        <w:tblPrEx>
-          <w:tblCellMar>
-            <w:top w:w="0" w:type="dxa"/>
-            <w:bottom w:w="0" w:type="dxa"/>
-          </w:tblCellMar>
-        </w:tblPrEx>
         <w:tc>
           <w:tcPr>
             <w:tcW w:w="2700" w:type="dxa"/>
@@ -19208,12 +18790,6 @@
         <w:gridCol w:w="2238"/>
       </w:tblGrid>
       <w:tr>
-        <w:tblPrEx>
-          <w:tblCellMar>
-            <w:top w:w="0" w:type="dxa"/>
-            <w:bottom w:w="0" w:type="dxa"/>
-          </w:tblCellMar>
-        </w:tblPrEx>
         <w:trPr>
           <w:tblHeader/>
         </w:trPr>
@@ -19352,12 +18928,6 @@
         </w:tc>
       </w:tr>
       <w:tr>
-        <w:tblPrEx>
-          <w:tblCellMar>
-            <w:top w:w="0" w:type="dxa"/>
-            <w:bottom w:w="0" w:type="dxa"/>
-          </w:tblCellMar>
-        </w:tblPrEx>
         <w:tc>
           <w:tcPr>
             <w:tcW w:w="3400" w:type="dxa"/>
@@ -19484,12 +19054,6 @@
         </w:tc>
       </w:tr>
       <w:tr>
-        <w:tblPrEx>
-          <w:tblCellMar>
-            <w:top w:w="0" w:type="dxa"/>
-            <w:bottom w:w="0" w:type="dxa"/>
-          </w:tblCellMar>
-        </w:tblPrEx>
         <w:tc>
           <w:tcPr>
             <w:tcW w:w="3400" w:type="dxa"/>
@@ -19620,12 +19184,6 @@
         </w:tc>
       </w:tr>
       <w:tr>
-        <w:tblPrEx>
-          <w:tblCellMar>
-            <w:top w:w="0" w:type="dxa"/>
-            <w:bottom w:w="0" w:type="dxa"/>
-          </w:tblCellMar>
-        </w:tblPrEx>
         <w:tc>
           <w:tcPr>
             <w:tcW w:w="3400" w:type="dxa"/>
@@ -19752,12 +19310,6 @@
         </w:tc>
       </w:tr>
       <w:tr>
-        <w:tblPrEx>
-          <w:tblCellMar>
-            <w:top w:w="0" w:type="dxa"/>
-            <w:bottom w:w="0" w:type="dxa"/>
-          </w:tblCellMar>
-        </w:tblPrEx>
         <w:tc>
           <w:tcPr>
             <w:tcW w:w="3400" w:type="dxa"/>
@@ -19888,12 +19440,6 @@
         </w:tc>
       </w:tr>
       <w:tr>
-        <w:tblPrEx>
-          <w:tblCellMar>
-            <w:top w:w="0" w:type="dxa"/>
-            <w:bottom w:w="0" w:type="dxa"/>
-          </w:tblCellMar>
-        </w:tblPrEx>
         <w:tc>
           <w:tcPr>
             <w:tcW w:w="3400" w:type="dxa"/>
@@ -20020,12 +19566,6 @@
         </w:tc>
       </w:tr>
       <w:tr>
-        <w:tblPrEx>
-          <w:tblCellMar>
-            <w:top w:w="0" w:type="dxa"/>
-            <w:bottom w:w="0" w:type="dxa"/>
-          </w:tblCellMar>
-        </w:tblPrEx>
         <w:tc>
           <w:tcPr>
             <w:tcW w:w="3400" w:type="dxa"/>
@@ -20156,12 +19696,6 @@
         </w:tc>
       </w:tr>
       <w:tr>
-        <w:tblPrEx>
-          <w:tblCellMar>
-            <w:top w:w="0" w:type="dxa"/>
-            <w:bottom w:w="0" w:type="dxa"/>
-          </w:tblCellMar>
-        </w:tblPrEx>
         <w:tc>
           <w:tcPr>
             <w:tcW w:w="3400" w:type="dxa"/>
@@ -20288,12 +19822,6 @@
         </w:tc>
       </w:tr>
       <w:tr>
-        <w:tblPrEx>
-          <w:tblCellMar>
-            <w:top w:w="0" w:type="dxa"/>
-            <w:bottom w:w="0" w:type="dxa"/>
-          </w:tblCellMar>
-        </w:tblPrEx>
         <w:tc>
           <w:tcPr>
             <w:tcW w:w="3400" w:type="dxa"/>
@@ -20424,12 +19952,6 @@
         </w:tc>
       </w:tr>
       <w:tr>
-        <w:tblPrEx>
-          <w:tblCellMar>
-            <w:top w:w="0" w:type="dxa"/>
-            <w:bottom w:w="0" w:type="dxa"/>
-          </w:tblCellMar>
-        </w:tblPrEx>
         <w:tc>
           <w:tcPr>
             <w:tcW w:w="3400" w:type="dxa"/>
@@ -20556,12 +20078,6 @@
         </w:tc>
       </w:tr>
       <w:tr>
-        <w:tblPrEx>
-          <w:tblCellMar>
-            <w:top w:w="0" w:type="dxa"/>
-            <w:bottom w:w="0" w:type="dxa"/>
-          </w:tblCellMar>
-        </w:tblPrEx>
         <w:tc>
           <w:tcPr>
             <w:tcW w:w="3400" w:type="dxa"/>
@@ -20692,12 +20208,6 @@
         </w:tc>
       </w:tr>
       <w:tr>
-        <w:tblPrEx>
-          <w:tblCellMar>
-            <w:top w:w="0" w:type="dxa"/>
-            <w:bottom w:w="0" w:type="dxa"/>
-          </w:tblCellMar>
-        </w:tblPrEx>
         <w:tc>
           <w:tcPr>
             <w:tcW w:w="3400" w:type="dxa"/>
@@ -20824,12 +20334,6 @@
         </w:tc>
       </w:tr>
       <w:tr>
-        <w:tblPrEx>
-          <w:tblCellMar>
-            <w:top w:w="0" w:type="dxa"/>
-            <w:bottom w:w="0" w:type="dxa"/>
-          </w:tblCellMar>
-        </w:tblPrEx>
         <w:tc>
           <w:tcPr>
             <w:tcW w:w="3400" w:type="dxa"/>
@@ -21343,12 +20847,6 @@
         <w:gridCol w:w="1238"/>
       </w:tblGrid>
       <w:tr>
-        <w:tblPrEx>
-          <w:tblCellMar>
-            <w:top w:w="0" w:type="dxa"/>
-            <w:bottom w:w="0" w:type="dxa"/>
-          </w:tblCellMar>
-        </w:tblPrEx>
         <w:trPr>
           <w:tblHeader/>
         </w:trPr>
@@ -21519,12 +21017,6 @@
         </w:tc>
       </w:tr>
       <w:tr>
-        <w:tblPrEx>
-          <w:tblCellMar>
-            <w:top w:w="0" w:type="dxa"/>
-            <w:bottom w:w="0" w:type="dxa"/>
-          </w:tblCellMar>
-        </w:tblPrEx>
         <w:tc>
           <w:tcPr>
             <w:tcW w:w="3000" w:type="dxa"/>
@@ -21682,12 +21174,6 @@
         </w:tc>
       </w:tr>
       <w:tr>
-        <w:tblPrEx>
-          <w:tblCellMar>
-            <w:top w:w="0" w:type="dxa"/>
-            <w:bottom w:w="0" w:type="dxa"/>
-          </w:tblCellMar>
-        </w:tblPrEx>
         <w:tc>
           <w:tcPr>
             <w:tcW w:w="3000" w:type="dxa"/>
@@ -21850,12 +21336,6 @@
         </w:tc>
       </w:tr>
       <w:tr>
-        <w:tblPrEx>
-          <w:tblCellMar>
-            <w:top w:w="0" w:type="dxa"/>
-            <w:bottom w:w="0" w:type="dxa"/>
-          </w:tblCellMar>
-        </w:tblPrEx>
         <w:tc>
           <w:tcPr>
             <w:tcW w:w="3000" w:type="dxa"/>
@@ -22013,12 +21493,6 @@
         </w:tc>
       </w:tr>
       <w:tr>
-        <w:tblPrEx>
-          <w:tblCellMar>
-            <w:top w:w="0" w:type="dxa"/>
-            <w:bottom w:w="0" w:type="dxa"/>
-          </w:tblCellMar>
-        </w:tblPrEx>
         <w:tc>
           <w:tcPr>
             <w:tcW w:w="3000" w:type="dxa"/>
@@ -22328,12 +21802,6 @@
         <w:gridCol w:w="2529"/>
       </w:tblGrid>
       <w:tr>
-        <w:tblPrEx>
-          <w:tblCellMar>
-            <w:top w:w="0" w:type="dxa"/>
-            <w:bottom w:w="0" w:type="dxa"/>
-          </w:tblCellMar>
-        </w:tblPrEx>
         <w:trPr>
           <w:tblHeader/>
         </w:trPr>
@@ -22538,12 +22006,6 @@
         </w:tc>
       </w:tr>
       <w:tr>
-        <w:tblPrEx>
-          <w:tblCellMar>
-            <w:top w:w="0" w:type="dxa"/>
-            <w:bottom w:w="0" w:type="dxa"/>
-          </w:tblCellMar>
-        </w:tblPrEx>
         <w:tc>
           <w:tcPr>
             <w:tcW w:w="1700" w:type="dxa"/>
@@ -22732,12 +22194,6 @@
         </w:tc>
       </w:tr>
       <w:tr>
-        <w:tblPrEx>
-          <w:tblCellMar>
-            <w:top w:w="0" w:type="dxa"/>
-            <w:bottom w:w="0" w:type="dxa"/>
-          </w:tblCellMar>
-        </w:tblPrEx>
         <w:tc>
           <w:tcPr>
             <w:tcW w:w="1700" w:type="dxa"/>
@@ -22932,12 +22388,6 @@
         </w:tc>
       </w:tr>
       <w:tr>
-        <w:tblPrEx>
-          <w:tblCellMar>
-            <w:top w:w="0" w:type="dxa"/>
-            <w:bottom w:w="0" w:type="dxa"/>
-          </w:tblCellMar>
-        </w:tblPrEx>
         <w:tc>
           <w:tcPr>
             <w:tcW w:w="1700" w:type="dxa"/>
@@ -23126,12 +22576,6 @@
         </w:tc>
       </w:tr>
       <w:tr>
-        <w:tblPrEx>
-          <w:tblCellMar>
-            <w:top w:w="0" w:type="dxa"/>
-            <w:bottom w:w="0" w:type="dxa"/>
-          </w:tblCellMar>
-        </w:tblPrEx>
         <w:tc>
           <w:tcPr>
             <w:tcW w:w="1700" w:type="dxa"/>
@@ -23326,12 +22770,6 @@
         </w:tc>
       </w:tr>
       <w:tr>
-        <w:tblPrEx>
-          <w:tblCellMar>
-            <w:top w:w="0" w:type="dxa"/>
-            <w:bottom w:w="0" w:type="dxa"/>
-          </w:tblCellMar>
-        </w:tblPrEx>
         <w:tc>
           <w:tcPr>
             <w:tcW w:w="1700" w:type="dxa"/>
@@ -23582,12 +23020,6 @@
         <w:gridCol w:w="1838"/>
       </w:tblGrid>
       <w:tr>
-        <w:tblPrEx>
-          <w:tblCellMar>
-            <w:top w:w="0" w:type="dxa"/>
-            <w:bottom w:w="0" w:type="dxa"/>
-          </w:tblCellMar>
-        </w:tblPrEx>
         <w:trPr>
           <w:tblHeader/>
         </w:trPr>
@@ -23725,12 +23157,6 @@
         </w:tc>
       </w:tr>
       <w:tr>
-        <w:tblPrEx>
-          <w:tblCellMar>
-            <w:top w:w="0" w:type="dxa"/>
-            <w:bottom w:w="0" w:type="dxa"/>
-          </w:tblCellMar>
-        </w:tblPrEx>
         <w:tc>
           <w:tcPr>
             <w:tcW w:w="3400" w:type="dxa"/>
@@ -23857,12 +23283,6 @@
         </w:tc>
       </w:tr>
       <w:tr>
-        <w:tblPrEx>
-          <w:tblCellMar>
-            <w:top w:w="0" w:type="dxa"/>
-            <w:bottom w:w="0" w:type="dxa"/>
-          </w:tblCellMar>
-        </w:tblPrEx>
         <w:tc>
           <w:tcPr>
             <w:tcW w:w="3400" w:type="dxa"/>
@@ -23993,12 +23413,6 @@
         </w:tc>
       </w:tr>
       <w:tr>
-        <w:tblPrEx>
-          <w:tblCellMar>
-            <w:top w:w="0" w:type="dxa"/>
-            <w:bottom w:w="0" w:type="dxa"/>
-          </w:tblCellMar>
-        </w:tblPrEx>
         <w:tc>
           <w:tcPr>
             <w:tcW w:w="3400" w:type="dxa"/>
@@ -24125,12 +23539,6 @@
         </w:tc>
       </w:tr>
       <w:tr>
-        <w:tblPrEx>
-          <w:tblCellMar>
-            <w:top w:w="0" w:type="dxa"/>
-            <w:bottom w:w="0" w:type="dxa"/>
-          </w:tblCellMar>
-        </w:tblPrEx>
         <w:tc>
           <w:tcPr>
             <w:tcW w:w="3400" w:type="dxa"/>
@@ -24262,12 +23670,6 @@
         </w:tc>
       </w:tr>
       <w:tr>
-        <w:tblPrEx>
-          <w:tblCellMar>
-            <w:top w:w="0" w:type="dxa"/>
-            <w:bottom w:w="0" w:type="dxa"/>
-          </w:tblCellMar>
-        </w:tblPrEx>
         <w:tc>
           <w:tcPr>
             <w:tcW w:w="3400" w:type="dxa"/>
@@ -25226,12 +24628,6 @@
         <w:gridCol w:w="3738"/>
       </w:tblGrid>
       <w:tr>
-        <w:tblPrEx>
-          <w:tblCellMar>
-            <w:top w:w="0" w:type="dxa"/>
-            <w:bottom w:w="0" w:type="dxa"/>
-          </w:tblCellMar>
-        </w:tblPrEx>
         <w:trPr>
           <w:tblHeader/>
         </w:trPr>
@@ -25369,12 +24765,6 @@
         </w:tc>
       </w:tr>
       <w:tr>
-        <w:tblPrEx>
-          <w:tblCellMar>
-            <w:top w:w="0" w:type="dxa"/>
-            <w:bottom w:w="0" w:type="dxa"/>
-          </w:tblCellMar>
-        </w:tblPrEx>
         <w:tc>
           <w:tcPr>
             <w:tcW w:w="1700" w:type="dxa"/>
@@ -25501,12 +24891,6 @@
         </w:tc>
       </w:tr>
       <w:tr>
-        <w:tblPrEx>
-          <w:tblCellMar>
-            <w:top w:w="0" w:type="dxa"/>
-            <w:bottom w:w="0" w:type="dxa"/>
-          </w:tblCellMar>
-        </w:tblPrEx>
         <w:tc>
           <w:tcPr>
             <w:tcW w:w="1700" w:type="dxa"/>
@@ -25637,12 +25021,6 @@
         </w:tc>
       </w:tr>
       <w:tr>
-        <w:tblPrEx>
-          <w:tblCellMar>
-            <w:top w:w="0" w:type="dxa"/>
-            <w:bottom w:w="0" w:type="dxa"/>
-          </w:tblCellMar>
-        </w:tblPrEx>
         <w:tc>
           <w:tcPr>
             <w:tcW w:w="1700" w:type="dxa"/>
@@ -25769,12 +25147,6 @@
         </w:tc>
       </w:tr>
       <w:tr>
-        <w:tblPrEx>
-          <w:tblCellMar>
-            <w:top w:w="0" w:type="dxa"/>
-            <w:bottom w:w="0" w:type="dxa"/>
-          </w:tblCellMar>
-        </w:tblPrEx>
         <w:tc>
           <w:tcPr>
             <w:tcW w:w="1700" w:type="dxa"/>
@@ -25905,12 +25277,6 @@
         </w:tc>
       </w:tr>
       <w:tr>
-        <w:tblPrEx>
-          <w:tblCellMar>
-            <w:top w:w="0" w:type="dxa"/>
-            <w:bottom w:w="0" w:type="dxa"/>
-          </w:tblCellMar>
-        </w:tblPrEx>
         <w:tc>
           <w:tcPr>
             <w:tcW w:w="1700" w:type="dxa"/>
@@ -26037,12 +25403,6 @@
         </w:tc>
       </w:tr>
       <w:tr>
-        <w:tblPrEx>
-          <w:tblCellMar>
-            <w:top w:w="0" w:type="dxa"/>
-            <w:bottom w:w="0" w:type="dxa"/>
-          </w:tblCellMar>
-        </w:tblPrEx>
         <w:tc>
           <w:tcPr>
             <w:tcW w:w="1700" w:type="dxa"/>
@@ -26173,12 +25533,6 @@
         </w:tc>
       </w:tr>
       <w:tr>
-        <w:tblPrEx>
-          <w:tblCellMar>
-            <w:top w:w="0" w:type="dxa"/>
-            <w:bottom w:w="0" w:type="dxa"/>
-          </w:tblCellMar>
-        </w:tblPrEx>
         <w:tc>
           <w:tcPr>
             <w:tcW w:w="1700" w:type="dxa"/>
@@ -26305,12 +25659,6 @@
         </w:tc>
       </w:tr>
       <w:tr>
-        <w:tblPrEx>
-          <w:tblCellMar>
-            <w:top w:w="0" w:type="dxa"/>
-            <w:bottom w:w="0" w:type="dxa"/>
-          </w:tblCellMar>
-        </w:tblPrEx>
         <w:tc>
           <w:tcPr>
             <w:tcW w:w="1700" w:type="dxa"/>
@@ -26441,12 +25789,6 @@
         </w:tc>
       </w:tr>
       <w:tr>
-        <w:tblPrEx>
-          <w:tblCellMar>
-            <w:top w:w="0" w:type="dxa"/>
-            <w:bottom w:w="0" w:type="dxa"/>
-          </w:tblCellMar>
-        </w:tblPrEx>
         <w:tc>
           <w:tcPr>
             <w:tcW w:w="1700" w:type="dxa"/>
@@ -26573,12 +25915,6 @@
         </w:tc>
       </w:tr>
       <w:tr>
-        <w:tblPrEx>
-          <w:tblCellMar>
-            <w:top w:w="0" w:type="dxa"/>
-            <w:bottom w:w="0" w:type="dxa"/>
-          </w:tblCellMar>
-        </w:tblPrEx>
         <w:tc>
           <w:tcPr>
             <w:tcW w:w="1700" w:type="dxa"/>
@@ -26709,12 +26045,6 @@
         </w:tc>
       </w:tr>
       <w:tr>
-        <w:tblPrEx>
-          <w:tblCellMar>
-            <w:top w:w="0" w:type="dxa"/>
-            <w:bottom w:w="0" w:type="dxa"/>
-          </w:tblCellMar>
-        </w:tblPrEx>
         <w:tc>
           <w:tcPr>
             <w:tcW w:w="1700" w:type="dxa"/>
@@ -26841,12 +26171,6 @@
         </w:tc>
       </w:tr>
       <w:tr>
-        <w:tblPrEx>
-          <w:tblCellMar>
-            <w:top w:w="0" w:type="dxa"/>
-            <w:bottom w:w="0" w:type="dxa"/>
-          </w:tblCellMar>
-        </w:tblPrEx>
         <w:tc>
           <w:tcPr>
             <w:tcW w:w="1700" w:type="dxa"/>
@@ -26977,12 +26301,6 @@
         </w:tc>
       </w:tr>
       <w:tr>
-        <w:tblPrEx>
-          <w:tblCellMar>
-            <w:top w:w="0" w:type="dxa"/>
-            <w:bottom w:w="0" w:type="dxa"/>
-          </w:tblCellMar>
-        </w:tblPrEx>
         <w:tc>
           <w:tcPr>
             <w:tcW w:w="1700" w:type="dxa"/>
@@ -27110,12 +26428,6 @@
         </w:tc>
       </w:tr>
       <w:tr>
-        <w:tblPrEx>
-          <w:tblCellMar>
-            <w:top w:w="0" w:type="dxa"/>
-            <w:bottom w:w="0" w:type="dxa"/>
-          </w:tblCellMar>
-        </w:tblPrEx>
         <w:tc>
           <w:tcPr>
             <w:tcW w:w="1700" w:type="dxa"/>
@@ -27246,12 +26558,6 @@
         </w:tc>
       </w:tr>
       <w:tr>
-        <w:tblPrEx>
-          <w:tblCellMar>
-            <w:top w:w="0" w:type="dxa"/>
-            <w:bottom w:w="0" w:type="dxa"/>
-          </w:tblCellMar>
-        </w:tblPrEx>
         <w:tc>
           <w:tcPr>
             <w:tcW w:w="1700" w:type="dxa"/>
@@ -27378,12 +26684,6 @@
         </w:tc>
       </w:tr>
       <w:tr>
-        <w:tblPrEx>
-          <w:tblCellMar>
-            <w:top w:w="0" w:type="dxa"/>
-            <w:bottom w:w="0" w:type="dxa"/>
-          </w:tblCellMar>
-        </w:tblPrEx>
         <w:tc>
           <w:tcPr>
             <w:tcW w:w="1700" w:type="dxa"/>
@@ -27514,12 +26814,6 @@
         </w:tc>
       </w:tr>
       <w:tr>
-        <w:tblPrEx>
-          <w:tblCellMar>
-            <w:top w:w="0" w:type="dxa"/>
-            <w:bottom w:w="0" w:type="dxa"/>
-          </w:tblCellMar>
-        </w:tblPrEx>
         <w:tc>
           <w:tcPr>
             <w:tcW w:w="1700" w:type="dxa"/>
@@ -27646,12 +26940,6 @@
         </w:tc>
       </w:tr>
       <w:tr>
-        <w:tblPrEx>
-          <w:tblCellMar>
-            <w:top w:w="0" w:type="dxa"/>
-            <w:bottom w:w="0" w:type="dxa"/>
-          </w:tblCellMar>
-        </w:tblPrEx>
         <w:tc>
           <w:tcPr>
             <w:tcW w:w="1700" w:type="dxa"/>
@@ -27782,12 +27070,6 @@
         </w:tc>
       </w:tr>
       <w:tr>
-        <w:tblPrEx>
-          <w:tblCellMar>
-            <w:top w:w="0" w:type="dxa"/>
-            <w:bottom w:w="0" w:type="dxa"/>
-          </w:tblCellMar>
-        </w:tblPrEx>
         <w:tc>
           <w:tcPr>
             <w:tcW w:w="1700" w:type="dxa"/>
@@ -28409,12 +27691,6 @@
         <w:gridCol w:w="2738"/>
       </w:tblGrid>
       <w:tr>
-        <w:tblPrEx>
-          <w:tblCellMar>
-            <w:top w:w="0" w:type="dxa"/>
-            <w:bottom w:w="0" w:type="dxa"/>
-          </w:tblCellMar>
-        </w:tblPrEx>
         <w:trPr>
           <w:tblHeader/>
         </w:trPr>
@@ -28520,12 +27796,6 @@
         </w:tc>
       </w:tr>
       <w:tr>
-        <w:tblPrEx>
-          <w:tblCellMar>
-            <w:top w:w="0" w:type="dxa"/>
-            <w:bottom w:w="0" w:type="dxa"/>
-          </w:tblCellMar>
-        </w:tblPrEx>
         <w:tc>
           <w:tcPr>
             <w:tcW w:w="4400" w:type="dxa"/>
@@ -28621,12 +27891,6 @@
         </w:tc>
       </w:tr>
       <w:tr>
-        <w:tblPrEx>
-          <w:tblCellMar>
-            <w:top w:w="0" w:type="dxa"/>
-            <w:bottom w:w="0" w:type="dxa"/>
-          </w:tblCellMar>
-        </w:tblPrEx>
         <w:tc>
           <w:tcPr>
             <w:tcW w:w="4400" w:type="dxa"/>
@@ -28725,12 +27989,6 @@
         </w:tc>
       </w:tr>
       <w:tr>
-        <w:tblPrEx>
-          <w:tblCellMar>
-            <w:top w:w="0" w:type="dxa"/>
-            <w:bottom w:w="0" w:type="dxa"/>
-          </w:tblCellMar>
-        </w:tblPrEx>
         <w:tc>
           <w:tcPr>
             <w:tcW w:w="4400" w:type="dxa"/>
@@ -28826,12 +28084,6 @@
         </w:tc>
       </w:tr>
       <w:tr>
-        <w:tblPrEx>
-          <w:tblCellMar>
-            <w:top w:w="0" w:type="dxa"/>
-            <w:bottom w:w="0" w:type="dxa"/>
-          </w:tblCellMar>
-        </w:tblPrEx>
         <w:tc>
           <w:tcPr>
             <w:tcW w:w="4400" w:type="dxa"/>
@@ -28930,12 +28182,6 @@
         </w:tc>
       </w:tr>
       <w:tr>
-        <w:tblPrEx>
-          <w:tblCellMar>
-            <w:top w:w="0" w:type="dxa"/>
-            <w:bottom w:w="0" w:type="dxa"/>
-          </w:tblCellMar>
-        </w:tblPrEx>
         <w:tc>
           <w:tcPr>
             <w:tcW w:w="4400" w:type="dxa"/>
@@ -29031,12 +28277,6 @@
         </w:tc>
       </w:tr>
       <w:tr>
-        <w:tblPrEx>
-          <w:tblCellMar>
-            <w:top w:w="0" w:type="dxa"/>
-            <w:bottom w:w="0" w:type="dxa"/>
-          </w:tblCellMar>
-        </w:tblPrEx>
         <w:tc>
           <w:tcPr>
             <w:tcW w:w="4400" w:type="dxa"/>

</xml_diff>